<commit_message>
Update Module 1.2 assignment screenshot
</commit_message>
<xml_diff>
--- a/module-1/Shrestha-Assignment1_2.docx
+++ b/module-1/Shrestha-Assignment1_2.docx
@@ -44,6 +44,9 @@
         <w:pStyle w:val="ListParagraph"/>
       </w:pPr>
       <w:r>
+        <w:rPr>
+          <w:noProof/>
+        </w:rPr>
         <w:drawing>
           <wp:inline distT="0" distB="0" distL="0" distR="0" wp14:anchorId="2279208E" wp14:editId="1BE2BA76">
             <wp:extent cx="4267231" cy="1066808"/>
@@ -94,14 +97,7 @@
           <w:i/>
           <w:iCs/>
         </w:rPr>
-        <w:t xml:space="preserve">Figure </w:t>
-      </w:r>
-      <w:r>
-        <w:rPr>
-          <w:i/>
-          <w:iCs/>
-        </w:rPr>
-        <w:t>1: Verification of Git global username and email configuration.</w:t>
+        <w:t>Figure 1: Verification of Git global username and email configuration.</w:t>
       </w:r>
     </w:p>
     <w:p>
@@ -143,19 +139,7 @@
           <w:rPr>
             <w:rStyle w:val="Hyperlink"/>
           </w:rPr>
-          <w:t>https://github.com/RockyShrestha/</w:t>
-        </w:r>
-        <w:r>
-          <w:rPr>
-            <w:rStyle w:val="Hyperlink"/>
-          </w:rPr>
-          <w:t>c</w:t>
-        </w:r>
-        <w:r>
-          <w:rPr>
-            <w:rStyle w:val="Hyperlink"/>
-          </w:rPr>
-          <w:t>sd-310</w:t>
+          <w:t>https://github.com/RockyShrestha/csd-310</w:t>
         </w:r>
       </w:hyperlink>
     </w:p>
@@ -195,17 +179,22 @@
     </w:p>
     <w:p>
       <w:pPr>
-        <w:ind w:left="720"/>
+        <w:pStyle w:val="ListParagraph"/>
+        <w:rPr>
+          <w:b/>
+          <w:bCs/>
+        </w:rPr>
       </w:pPr>
       <w:r>
         <w:rPr>
-          <w:noProof/>
+          <w:b/>
+          <w:bCs/>
         </w:rPr>
         <w:drawing>
-          <wp:inline distT="0" distB="0" distL="0" distR="0" wp14:anchorId="395FAD71" wp14:editId="0C387D08">
-            <wp:extent cx="5308349" cy="2695575"/>
-            <wp:effectExtent l="0" t="0" r="6985" b="0"/>
-            <wp:docPr id="885207662" name="Picture 1"/>
+          <wp:inline distT="0" distB="0" distL="0" distR="0" wp14:anchorId="52C8D359" wp14:editId="29BB1565">
+            <wp:extent cx="5266307" cy="3024188"/>
+            <wp:effectExtent l="0" t="0" r="0" b="5080"/>
+            <wp:docPr id="2005687655" name="Picture 1"/>
             <wp:cNvGraphicFramePr>
               <a:graphicFrameLocks xmlns:a="http://schemas.openxmlformats.org/drawingml/2006/main" noChangeAspect="1"/>
             </wp:cNvGraphicFramePr>
@@ -213,7 +202,7 @@
               <a:graphicData uri="http://schemas.openxmlformats.org/drawingml/2006/picture">
                 <pic:pic xmlns:pic="http://schemas.openxmlformats.org/drawingml/2006/picture">
                   <pic:nvPicPr>
-                    <pic:cNvPr id="885207662" name=""/>
+                    <pic:cNvPr id="2005687655" name=""/>
                     <pic:cNvPicPr/>
                   </pic:nvPicPr>
                   <pic:blipFill>
@@ -225,7 +214,7 @@
                   <pic:spPr>
                     <a:xfrm>
                       <a:off x="0" y="0"/>
-                      <a:ext cx="5319195" cy="2701082"/>
+                      <a:ext cx="5276905" cy="3030274"/>
                     </a:xfrm>
                     <a:prstGeom prst="rect">
                       <a:avLst/>
@@ -237,6 +226,11 @@
           </wp:inline>
         </w:drawing>
       </w:r>
+    </w:p>
+    <w:p>
+      <w:pPr>
+        <w:ind w:left="720"/>
+      </w:pPr>
       <w:r>
         <w:rPr>
           <w:i/>
@@ -245,7 +239,6 @@
         <w:t>Figure 2: CSD-310 GitHub repository.</w:t>
       </w:r>
     </w:p>
-    <w:p/>
     <w:p>
       <w:pPr>
         <w:pStyle w:val="ListParagraph"/>

</xml_diff>